<commit_message>
tạm thời nghỉ, sáng mai làm tiếp
</commit_message>
<xml_diff>
--- a/docs/BaoCao_QLNT_Nhom9.docx
+++ b/docs/BaoCao_QLNT_Nhom9.docx
@@ -321,7 +321,7 @@
           <w:szCs w:val="30"/>
           <w:lang w:eastAsia="zh-CN"/>
         </w:rPr>
-        <w:t>CH</w:t>
+        <w:t>ĐỀ</w:t>
       </w:r>
       <w:r>
         <w:rPr>
@@ -332,7 +332,18 @@
           <w:szCs w:val="30"/>
           <w:lang w:eastAsia="zh-CN"/>
         </w:rPr>
-        <w:t>Ủ ĐỀ: HỆ THỐNG QUẢN LÍ NHÀ TÙ</w:t>
+        <w:t xml:space="preserve"> TÀI</w:t>
+      </w:r>
+      <w:r>
+        <w:rPr>
+          <w:rFonts w:eastAsia="SimSun"/>
+          <w:b/>
+          <w:bCs/>
+          <w:sz w:val="30"/>
+          <w:szCs w:val="30"/>
+          <w:lang w:eastAsia="zh-CN"/>
+        </w:rPr>
+        <w:t>: HỆ THỐNG QUẢN LÍ NHÀ TÙ</w:t>
       </w:r>
     </w:p>
     <w:p>
@@ -973,8 +984,6 @@
             <w:r>
               <w:t xml:space="preserve"> dữ liệu mẫu.</w:t>
             </w:r>
-            <w:bookmarkStart w:id="0" w:name="_GoBack"/>
-            <w:bookmarkEnd w:id="0"/>
           </w:p>
           <w:p>
             <w:r>
@@ -1118,6 +1127,288 @@
       </w:tr>
     </w:tbl>
     <w:p/>
+    <w:p/>
+    <w:p/>
+    <w:p/>
+    <w:p/>
+    <w:p/>
+    <w:p/>
+    <w:p/>
+    <w:p/>
+    <w:p/>
+    <w:p/>
+    <w:p/>
+    <w:p/>
+    <w:p/>
+    <w:p/>
+    <w:p/>
+    <w:p/>
+    <w:p/>
+    <w:p/>
+    <w:p/>
+    <w:p/>
+    <w:p/>
+    <w:p>
+      <w:pPr>
+        <w:rPr>
+          <w:b/>
+          <w:bCs/>
+        </w:rPr>
+      </w:pPr>
+      <w:r>
+        <w:rPr>
+          <w:b/>
+          <w:bCs/>
+        </w:rPr>
+        <w:lastRenderedPageBreak/>
+        <w:t xml:space="preserve">CHƯƠNG 1: </w:t>
+      </w:r>
+      <w:r>
+        <w:rPr>
+          <w:b/>
+          <w:bCs/>
+        </w:rPr>
+        <w:t>GIỚI THIỆU ĐỀ TÀI</w:t>
+      </w:r>
+    </w:p>
+    <w:p>
+      <w:pPr>
+        <w:pStyle w:val="ListParagraph"/>
+        <w:numPr>
+          <w:ilvl w:val="1"/>
+          <w:numId w:val="13"/>
+        </w:numPr>
+        <w:rPr>
+          <w:b/>
+          <w:bCs/>
+        </w:rPr>
+      </w:pPr>
+      <w:r>
+        <w:rPr>
+          <w:b/>
+          <w:bCs/>
+        </w:rPr>
+        <w:t xml:space="preserve">Tên đề tài: </w:t>
+      </w:r>
+    </w:p>
+    <w:p>
+      <w:pPr>
+        <w:ind w:firstLine="720"/>
+        <w:rPr>
+          <w:bCs/>
+        </w:rPr>
+      </w:pPr>
+      <w:r>
+        <w:rPr>
+          <w:bCs/>
+        </w:rPr>
+        <w:t>Hệ thống quản lí nhà tù</w:t>
+      </w:r>
+    </w:p>
+    <w:p>
+      <w:pPr>
+        <w:rPr>
+          <w:b/>
+          <w:bCs/>
+        </w:rPr>
+      </w:pPr>
+      <w:r>
+        <w:rPr>
+          <w:b/>
+          <w:bCs/>
+        </w:rPr>
+        <w:t>1.</w:t>
+      </w:r>
+      <w:r>
+        <w:rPr>
+          <w:b/>
+          <w:bCs/>
+        </w:rPr>
+        <w:t>2</w:t>
+      </w:r>
+      <w:r>
+        <w:rPr>
+          <w:b/>
+          <w:bCs/>
+        </w:rPr>
+        <w:t xml:space="preserve"> </w:t>
+      </w:r>
+      <w:r>
+        <w:rPr>
+          <w:b/>
+          <w:bCs/>
+        </w:rPr>
+        <w:t>Lí do chọn</w:t>
+      </w:r>
+      <w:r>
+        <w:rPr>
+          <w:b/>
+          <w:bCs/>
+        </w:rPr>
+        <w:t xml:space="preserve"> đề tài</w:t>
+      </w:r>
+      <w:r>
+        <w:rPr>
+          <w:b/>
+          <w:bCs/>
+        </w:rPr>
+        <w:t>:</w:t>
+      </w:r>
+    </w:p>
+    <w:p>
+      <w:pPr>
+        <w:ind w:firstLine="720"/>
+      </w:pPr>
+      <w:r>
+        <w:rPr>
+          <w:bCs/>
+        </w:rPr>
+        <w:t>Hi</w:t>
+      </w:r>
+      <w:r>
+        <w:rPr>
+          <w:bCs/>
+        </w:rPr>
+        <w:t xml:space="preserve">ện nay, việc quản lí thông tin trong các cơ quan ngày càng cần được tin học hoá nhằm đảm bảo tính chính xác, bảo mật và thuận tiện trong quá trình quản lí, truy xuất thông tin. </w:t>
+      </w:r>
+      <w:r>
+        <w:t>Việc quản l</w:t>
+      </w:r>
+      <w:r>
+        <w:t>í</w:t>
+      </w:r>
+      <w:r>
+        <w:t xml:space="preserve"> thủ công bằng giấy tờ ho</w:t>
+      </w:r>
+      <w:bookmarkStart w:id="0" w:name="_GoBack"/>
+      <w:bookmarkEnd w:id="0"/>
+      <w:r>
+        <w:t xml:space="preserve">ặc các công cụ văn phòng </w:t>
+      </w:r>
+      <w:r>
+        <w:t>như Excel</w:t>
+      </w:r>
+      <w:r>
+        <w:t xml:space="preserve"> bộc lộ nhiều hạn chế như: dễ sai sót dữ liệu, tốn thời gian tra cứu và khó khăn trong việc thống kê, báo cáo.</w:t>
+      </w:r>
+    </w:p>
+    <w:p>
+      <w:pPr>
+        <w:ind w:firstLine="720"/>
+      </w:pPr>
+      <w:r>
+        <w:t>Vì vậy, nhóm quyết định xây dựng đ</w:t>
+      </w:r>
+      <w:r>
+        <w:t>ề tài “Hệ thống quản lí nhà tù” nhằm hỗ trợ quản lí các thông tin liên quan đến tù nhân, phòng giam, quản ngục, bản án, cải tạo, lịch thăm nuôi và vi phạm. Hệ thống sử dụng hệ quản trị cơ sở dữ liệu SQL Server để lưu trữ và xử lí dữ liệu.</w:t>
+      </w:r>
+      <w:r>
+        <w:t xml:space="preserve"> </w:t>
+      </w:r>
+    </w:p>
+    <w:p>
+      <w:pPr>
+        <w:ind w:firstLine="720"/>
+      </w:pPr>
+      <w:r>
+        <w:t>Thông qua đề tài</w:t>
+      </w:r>
+      <w:r>
+        <w:t xml:space="preserve"> này</w:t>
+      </w:r>
+      <w:r>
+        <w:t>,</w:t>
+      </w:r>
+      <w:r>
+        <w:t xml:space="preserve"> nhóm </w:t>
+      </w:r>
+      <w:r>
+        <w:t xml:space="preserve">có thể </w:t>
+      </w:r>
+      <w:r>
+        <w:t xml:space="preserve">áp dụng các kiến thức đã học về thiết kế </w:t>
+      </w:r>
+      <w:r>
+        <w:t>cơ sở dữ liệu</w:t>
+      </w:r>
+      <w:r>
+        <w:t xml:space="preserve">, </w:t>
+      </w:r>
+      <w:r>
+        <w:t xml:space="preserve">thao tác và truy vấn dữ liệu, tạo và </w:t>
+      </w:r>
+      <w:r>
+        <w:t xml:space="preserve">phân </w:t>
+      </w:r>
+      <w:r>
+        <w:t>quyền người dùng, viết</w:t>
+      </w:r>
+      <w:r>
+        <w:t xml:space="preserve"> các</w:t>
+      </w:r>
+      <w:r>
+        <w:t xml:space="preserve"> thủ tục lưu trữ </w:t>
+      </w:r>
+      <m:oMath>
+        <m:r>
+          <w:rPr>
+            <w:rFonts w:ascii="Cambria Math" w:hAnsi="Cambria Math"/>
+          </w:rPr>
+          <m:t>-</m:t>
+        </m:r>
+      </m:oMath>
+      <w:r>
+        <w:t xml:space="preserve"> hàm</w:t>
+      </w:r>
+      <w:r>
+        <w:t xml:space="preserve"> </w:t>
+      </w:r>
+      <m:oMath>
+        <m:r>
+          <w:rPr>
+            <w:rFonts w:ascii="Cambria Math" w:hAnsi="Cambria Math"/>
+          </w:rPr>
+          <m:t>-</m:t>
+        </m:r>
+      </m:oMath>
+      <w:r>
+        <w:t xml:space="preserve"> trigger </w:t>
+      </w:r>
+      <w:r>
+        <w:t>và kết nối giao diện.</w:t>
+      </w:r>
+    </w:p>
+    <w:p>
+      <w:pPr>
+        <w:rPr>
+          <w:b/>
+        </w:rPr>
+      </w:pPr>
+      <w:r>
+        <w:rPr>
+          <w:b/>
+        </w:rPr>
+        <w:t>1.3 Mục tiêu</w:t>
+      </w:r>
+    </w:p>
+    <w:p>
+      <w:pPr>
+        <w:rPr>
+          <w:bCs/>
+        </w:rPr>
+      </w:pPr>
+      <w:r>
+        <w:rPr>
+          <w:bCs/>
+        </w:rPr>
+        <w:t>Đề tài được thực hiện với mục tiêu sau:</w:t>
+      </w:r>
+    </w:p>
+    <w:p>
+      <w:r>
+        <w:t>- Xây dựng cơ sở dữ liệu quản lí nhà tù đạt chuẩn 3NF</w:t>
+      </w:r>
+    </w:p>
     <w:sectPr>
       <w:pgSz w:w="12240" w:h="15840"/>
       <w:pgMar w:top="1134" w:right="1134" w:bottom="1134" w:left="1701" w:header="720" w:footer="720" w:gutter="0"/>
@@ -1393,6 +1684,155 @@
     </w:lvl>
   </w:abstractNum>
   <w:abstractNum w:abstractNumId="2" w15:restartNumberingAfterBreak="0">
+    <w:nsid w:val="0FB959DB"/>
+    <w:multiLevelType w:val="multilevel"/>
+    <w:tmpl w:val="DBCA6338"/>
+    <w:lvl w:ilvl="0">
+      <w:start w:val="1"/>
+      <w:numFmt w:val="bullet"/>
+      <w:lvlText w:val=""/>
+      <w:lvlJc w:val="left"/>
+      <w:pPr>
+        <w:tabs>
+          <w:tab w:val="num" w:pos="720"/>
+        </w:tabs>
+        <w:ind w:left="720" w:hanging="360"/>
+      </w:pPr>
+      <w:rPr>
+        <w:rFonts w:ascii="Symbol" w:hAnsi="Symbol" w:hint="default"/>
+        <w:sz w:val="20"/>
+      </w:rPr>
+    </w:lvl>
+    <w:lvl w:ilvl="1" w:tentative="1">
+      <w:start w:val="1"/>
+      <w:numFmt w:val="bullet"/>
+      <w:lvlText w:val="o"/>
+      <w:lvlJc w:val="left"/>
+      <w:pPr>
+        <w:tabs>
+          <w:tab w:val="num" w:pos="1440"/>
+        </w:tabs>
+        <w:ind w:left="1440" w:hanging="360"/>
+      </w:pPr>
+      <w:rPr>
+        <w:rFonts w:ascii="Courier New" w:hAnsi="Courier New" w:hint="default"/>
+        <w:sz w:val="20"/>
+      </w:rPr>
+    </w:lvl>
+    <w:lvl w:ilvl="2" w:tentative="1">
+      <w:start w:val="1"/>
+      <w:numFmt w:val="bullet"/>
+      <w:lvlText w:val=""/>
+      <w:lvlJc w:val="left"/>
+      <w:pPr>
+        <w:tabs>
+          <w:tab w:val="num" w:pos="2160"/>
+        </w:tabs>
+        <w:ind w:left="2160" w:hanging="360"/>
+      </w:pPr>
+      <w:rPr>
+        <w:rFonts w:ascii="Wingdings" w:hAnsi="Wingdings" w:hint="default"/>
+        <w:sz w:val="20"/>
+      </w:rPr>
+    </w:lvl>
+    <w:lvl w:ilvl="3" w:tentative="1">
+      <w:start w:val="1"/>
+      <w:numFmt w:val="bullet"/>
+      <w:lvlText w:val=""/>
+      <w:lvlJc w:val="left"/>
+      <w:pPr>
+        <w:tabs>
+          <w:tab w:val="num" w:pos="2880"/>
+        </w:tabs>
+        <w:ind w:left="2880" w:hanging="360"/>
+      </w:pPr>
+      <w:rPr>
+        <w:rFonts w:ascii="Wingdings" w:hAnsi="Wingdings" w:hint="default"/>
+        <w:sz w:val="20"/>
+      </w:rPr>
+    </w:lvl>
+    <w:lvl w:ilvl="4" w:tentative="1">
+      <w:start w:val="1"/>
+      <w:numFmt w:val="bullet"/>
+      <w:lvlText w:val=""/>
+      <w:lvlJc w:val="left"/>
+      <w:pPr>
+        <w:tabs>
+          <w:tab w:val="num" w:pos="3600"/>
+        </w:tabs>
+        <w:ind w:left="3600" w:hanging="360"/>
+      </w:pPr>
+      <w:rPr>
+        <w:rFonts w:ascii="Wingdings" w:hAnsi="Wingdings" w:hint="default"/>
+        <w:sz w:val="20"/>
+      </w:rPr>
+    </w:lvl>
+    <w:lvl w:ilvl="5" w:tentative="1">
+      <w:start w:val="1"/>
+      <w:numFmt w:val="bullet"/>
+      <w:lvlText w:val=""/>
+      <w:lvlJc w:val="left"/>
+      <w:pPr>
+        <w:tabs>
+          <w:tab w:val="num" w:pos="4320"/>
+        </w:tabs>
+        <w:ind w:left="4320" w:hanging="360"/>
+      </w:pPr>
+      <w:rPr>
+        <w:rFonts w:ascii="Wingdings" w:hAnsi="Wingdings" w:hint="default"/>
+        <w:sz w:val="20"/>
+      </w:rPr>
+    </w:lvl>
+    <w:lvl w:ilvl="6" w:tentative="1">
+      <w:start w:val="1"/>
+      <w:numFmt w:val="bullet"/>
+      <w:lvlText w:val=""/>
+      <w:lvlJc w:val="left"/>
+      <w:pPr>
+        <w:tabs>
+          <w:tab w:val="num" w:pos="5040"/>
+        </w:tabs>
+        <w:ind w:left="5040" w:hanging="360"/>
+      </w:pPr>
+      <w:rPr>
+        <w:rFonts w:ascii="Wingdings" w:hAnsi="Wingdings" w:hint="default"/>
+        <w:sz w:val="20"/>
+      </w:rPr>
+    </w:lvl>
+    <w:lvl w:ilvl="7" w:tentative="1">
+      <w:start w:val="1"/>
+      <w:numFmt w:val="bullet"/>
+      <w:lvlText w:val=""/>
+      <w:lvlJc w:val="left"/>
+      <w:pPr>
+        <w:tabs>
+          <w:tab w:val="num" w:pos="5760"/>
+        </w:tabs>
+        <w:ind w:left="5760" w:hanging="360"/>
+      </w:pPr>
+      <w:rPr>
+        <w:rFonts w:ascii="Wingdings" w:hAnsi="Wingdings" w:hint="default"/>
+        <w:sz w:val="20"/>
+      </w:rPr>
+    </w:lvl>
+    <w:lvl w:ilvl="8" w:tentative="1">
+      <w:start w:val="1"/>
+      <w:numFmt w:val="bullet"/>
+      <w:lvlText w:val=""/>
+      <w:lvlJc w:val="left"/>
+      <w:pPr>
+        <w:tabs>
+          <w:tab w:val="num" w:pos="6480"/>
+        </w:tabs>
+        <w:ind w:left="6480" w:hanging="360"/>
+      </w:pPr>
+      <w:rPr>
+        <w:rFonts w:ascii="Wingdings" w:hAnsi="Wingdings" w:hint="default"/>
+        <w:sz w:val="20"/>
+      </w:rPr>
+    </w:lvl>
+  </w:abstractNum>
+  <w:abstractNum w:abstractNumId="3" w15:restartNumberingAfterBreak="0">
     <w:nsid w:val="150514D6"/>
     <w:multiLevelType w:val="hybridMultilevel"/>
     <w:tmpl w:val="98D25EF6"/>
@@ -1481,7 +1921,156 @@
       </w:pPr>
     </w:lvl>
   </w:abstractNum>
-  <w:abstractNum w:abstractNumId="3" w15:restartNumberingAfterBreak="0">
+  <w:abstractNum w:abstractNumId="4" w15:restartNumberingAfterBreak="0">
+    <w:nsid w:val="15E3639C"/>
+    <w:multiLevelType w:val="multilevel"/>
+    <w:tmpl w:val="5E8ECD9C"/>
+    <w:lvl w:ilvl="0">
+      <w:start w:val="1"/>
+      <w:numFmt w:val="bullet"/>
+      <w:lvlText w:val=""/>
+      <w:lvlJc w:val="left"/>
+      <w:pPr>
+        <w:tabs>
+          <w:tab w:val="num" w:pos="720"/>
+        </w:tabs>
+        <w:ind w:left="720" w:hanging="360"/>
+      </w:pPr>
+      <w:rPr>
+        <w:rFonts w:ascii="Symbol" w:hAnsi="Symbol" w:hint="default"/>
+        <w:sz w:val="20"/>
+      </w:rPr>
+    </w:lvl>
+    <w:lvl w:ilvl="1" w:tentative="1">
+      <w:start w:val="1"/>
+      <w:numFmt w:val="bullet"/>
+      <w:lvlText w:val="o"/>
+      <w:lvlJc w:val="left"/>
+      <w:pPr>
+        <w:tabs>
+          <w:tab w:val="num" w:pos="1440"/>
+        </w:tabs>
+        <w:ind w:left="1440" w:hanging="360"/>
+      </w:pPr>
+      <w:rPr>
+        <w:rFonts w:ascii="Courier New" w:hAnsi="Courier New" w:hint="default"/>
+        <w:sz w:val="20"/>
+      </w:rPr>
+    </w:lvl>
+    <w:lvl w:ilvl="2" w:tentative="1">
+      <w:start w:val="1"/>
+      <w:numFmt w:val="bullet"/>
+      <w:lvlText w:val=""/>
+      <w:lvlJc w:val="left"/>
+      <w:pPr>
+        <w:tabs>
+          <w:tab w:val="num" w:pos="2160"/>
+        </w:tabs>
+        <w:ind w:left="2160" w:hanging="360"/>
+      </w:pPr>
+      <w:rPr>
+        <w:rFonts w:ascii="Wingdings" w:hAnsi="Wingdings" w:hint="default"/>
+        <w:sz w:val="20"/>
+      </w:rPr>
+    </w:lvl>
+    <w:lvl w:ilvl="3" w:tentative="1">
+      <w:start w:val="1"/>
+      <w:numFmt w:val="bullet"/>
+      <w:lvlText w:val=""/>
+      <w:lvlJc w:val="left"/>
+      <w:pPr>
+        <w:tabs>
+          <w:tab w:val="num" w:pos="2880"/>
+        </w:tabs>
+        <w:ind w:left="2880" w:hanging="360"/>
+      </w:pPr>
+      <w:rPr>
+        <w:rFonts w:ascii="Wingdings" w:hAnsi="Wingdings" w:hint="default"/>
+        <w:sz w:val="20"/>
+      </w:rPr>
+    </w:lvl>
+    <w:lvl w:ilvl="4" w:tentative="1">
+      <w:start w:val="1"/>
+      <w:numFmt w:val="bullet"/>
+      <w:lvlText w:val=""/>
+      <w:lvlJc w:val="left"/>
+      <w:pPr>
+        <w:tabs>
+          <w:tab w:val="num" w:pos="3600"/>
+        </w:tabs>
+        <w:ind w:left="3600" w:hanging="360"/>
+      </w:pPr>
+      <w:rPr>
+        <w:rFonts w:ascii="Wingdings" w:hAnsi="Wingdings" w:hint="default"/>
+        <w:sz w:val="20"/>
+      </w:rPr>
+    </w:lvl>
+    <w:lvl w:ilvl="5" w:tentative="1">
+      <w:start w:val="1"/>
+      <w:numFmt w:val="bullet"/>
+      <w:lvlText w:val=""/>
+      <w:lvlJc w:val="left"/>
+      <w:pPr>
+        <w:tabs>
+          <w:tab w:val="num" w:pos="4320"/>
+        </w:tabs>
+        <w:ind w:left="4320" w:hanging="360"/>
+      </w:pPr>
+      <w:rPr>
+        <w:rFonts w:ascii="Wingdings" w:hAnsi="Wingdings" w:hint="default"/>
+        <w:sz w:val="20"/>
+      </w:rPr>
+    </w:lvl>
+    <w:lvl w:ilvl="6" w:tentative="1">
+      <w:start w:val="1"/>
+      <w:numFmt w:val="bullet"/>
+      <w:lvlText w:val=""/>
+      <w:lvlJc w:val="left"/>
+      <w:pPr>
+        <w:tabs>
+          <w:tab w:val="num" w:pos="5040"/>
+        </w:tabs>
+        <w:ind w:left="5040" w:hanging="360"/>
+      </w:pPr>
+      <w:rPr>
+        <w:rFonts w:ascii="Wingdings" w:hAnsi="Wingdings" w:hint="default"/>
+        <w:sz w:val="20"/>
+      </w:rPr>
+    </w:lvl>
+    <w:lvl w:ilvl="7" w:tentative="1">
+      <w:start w:val="1"/>
+      <w:numFmt w:val="bullet"/>
+      <w:lvlText w:val=""/>
+      <w:lvlJc w:val="left"/>
+      <w:pPr>
+        <w:tabs>
+          <w:tab w:val="num" w:pos="5760"/>
+        </w:tabs>
+        <w:ind w:left="5760" w:hanging="360"/>
+      </w:pPr>
+      <w:rPr>
+        <w:rFonts w:ascii="Wingdings" w:hAnsi="Wingdings" w:hint="default"/>
+        <w:sz w:val="20"/>
+      </w:rPr>
+    </w:lvl>
+    <w:lvl w:ilvl="8" w:tentative="1">
+      <w:start w:val="1"/>
+      <w:numFmt w:val="bullet"/>
+      <w:lvlText w:val=""/>
+      <w:lvlJc w:val="left"/>
+      <w:pPr>
+        <w:tabs>
+          <w:tab w:val="num" w:pos="6480"/>
+        </w:tabs>
+        <w:ind w:left="6480" w:hanging="360"/>
+      </w:pPr>
+      <w:rPr>
+        <w:rFonts w:ascii="Wingdings" w:hAnsi="Wingdings" w:hint="default"/>
+        <w:sz w:val="20"/>
+      </w:rPr>
+    </w:lvl>
+  </w:abstractNum>
+  <w:abstractNum w:abstractNumId="5" w15:restartNumberingAfterBreak="0">
     <w:nsid w:val="1C5225E4"/>
     <w:multiLevelType w:val="hybridMultilevel"/>
     <w:tmpl w:val="E1DAFD86"/>
@@ -1594,7 +2183,120 @@
       </w:rPr>
     </w:lvl>
   </w:abstractNum>
-  <w:abstractNum w:abstractNumId="4" w15:restartNumberingAfterBreak="0">
+  <w:abstractNum w:abstractNumId="6" w15:restartNumberingAfterBreak="0">
+    <w:nsid w:val="1EFC67FE"/>
+    <w:multiLevelType w:val="hybridMultilevel"/>
+    <w:tmpl w:val="FCD2ADB8"/>
+    <w:lvl w:ilvl="0" w:tplc="D0329E14">
+      <w:start w:val="1"/>
+      <w:numFmt w:val="bullet"/>
+      <w:lvlText w:val="-"/>
+      <w:lvlJc w:val="left"/>
+      <w:pPr>
+        <w:ind w:left="720" w:hanging="360"/>
+      </w:pPr>
+      <w:rPr>
+        <w:rFonts w:ascii="Times New Roman" w:eastAsia="Times New Roman" w:hAnsi="Times New Roman" w:cs="Times New Roman" w:hint="default"/>
+      </w:rPr>
+    </w:lvl>
+    <w:lvl w:ilvl="1" w:tplc="04090003" w:tentative="1">
+      <w:start w:val="1"/>
+      <w:numFmt w:val="bullet"/>
+      <w:lvlText w:val="o"/>
+      <w:lvlJc w:val="left"/>
+      <w:pPr>
+        <w:ind w:left="1440" w:hanging="360"/>
+      </w:pPr>
+      <w:rPr>
+        <w:rFonts w:ascii="Courier New" w:hAnsi="Courier New" w:cs="Courier New" w:hint="default"/>
+      </w:rPr>
+    </w:lvl>
+    <w:lvl w:ilvl="2" w:tplc="04090005" w:tentative="1">
+      <w:start w:val="1"/>
+      <w:numFmt w:val="bullet"/>
+      <w:lvlText w:val=""/>
+      <w:lvlJc w:val="left"/>
+      <w:pPr>
+        <w:ind w:left="2160" w:hanging="360"/>
+      </w:pPr>
+      <w:rPr>
+        <w:rFonts w:ascii="Wingdings" w:hAnsi="Wingdings" w:hint="default"/>
+      </w:rPr>
+    </w:lvl>
+    <w:lvl w:ilvl="3" w:tplc="04090001" w:tentative="1">
+      <w:start w:val="1"/>
+      <w:numFmt w:val="bullet"/>
+      <w:lvlText w:val=""/>
+      <w:lvlJc w:val="left"/>
+      <w:pPr>
+        <w:ind w:left="2880" w:hanging="360"/>
+      </w:pPr>
+      <w:rPr>
+        <w:rFonts w:ascii="Symbol" w:hAnsi="Symbol" w:hint="default"/>
+      </w:rPr>
+    </w:lvl>
+    <w:lvl w:ilvl="4" w:tplc="04090003" w:tentative="1">
+      <w:start w:val="1"/>
+      <w:numFmt w:val="bullet"/>
+      <w:lvlText w:val="o"/>
+      <w:lvlJc w:val="left"/>
+      <w:pPr>
+        <w:ind w:left="3600" w:hanging="360"/>
+      </w:pPr>
+      <w:rPr>
+        <w:rFonts w:ascii="Courier New" w:hAnsi="Courier New" w:cs="Courier New" w:hint="default"/>
+      </w:rPr>
+    </w:lvl>
+    <w:lvl w:ilvl="5" w:tplc="04090005" w:tentative="1">
+      <w:start w:val="1"/>
+      <w:numFmt w:val="bullet"/>
+      <w:lvlText w:val=""/>
+      <w:lvlJc w:val="left"/>
+      <w:pPr>
+        <w:ind w:left="4320" w:hanging="360"/>
+      </w:pPr>
+      <w:rPr>
+        <w:rFonts w:ascii="Wingdings" w:hAnsi="Wingdings" w:hint="default"/>
+      </w:rPr>
+    </w:lvl>
+    <w:lvl w:ilvl="6" w:tplc="04090001" w:tentative="1">
+      <w:start w:val="1"/>
+      <w:numFmt w:val="bullet"/>
+      <w:lvlText w:val=""/>
+      <w:lvlJc w:val="left"/>
+      <w:pPr>
+        <w:ind w:left="5040" w:hanging="360"/>
+      </w:pPr>
+      <w:rPr>
+        <w:rFonts w:ascii="Symbol" w:hAnsi="Symbol" w:hint="default"/>
+      </w:rPr>
+    </w:lvl>
+    <w:lvl w:ilvl="7" w:tplc="04090003" w:tentative="1">
+      <w:start w:val="1"/>
+      <w:numFmt w:val="bullet"/>
+      <w:lvlText w:val="o"/>
+      <w:lvlJc w:val="left"/>
+      <w:pPr>
+        <w:ind w:left="5760" w:hanging="360"/>
+      </w:pPr>
+      <w:rPr>
+        <w:rFonts w:ascii="Courier New" w:hAnsi="Courier New" w:cs="Courier New" w:hint="default"/>
+      </w:rPr>
+    </w:lvl>
+    <w:lvl w:ilvl="8" w:tplc="04090005" w:tentative="1">
+      <w:start w:val="1"/>
+      <w:numFmt w:val="bullet"/>
+      <w:lvlText w:val=""/>
+      <w:lvlJc w:val="left"/>
+      <w:pPr>
+        <w:ind w:left="6480" w:hanging="360"/>
+      </w:pPr>
+      <w:rPr>
+        <w:rFonts w:ascii="Wingdings" w:hAnsi="Wingdings" w:hint="default"/>
+      </w:rPr>
+    </w:lvl>
+  </w:abstractNum>
+  <w:abstractNum w:abstractNumId="7" w15:restartNumberingAfterBreak="0">
     <w:nsid w:val="21AB4B1D"/>
     <w:multiLevelType w:val="hybridMultilevel"/>
     <w:tmpl w:val="F4502D68"/>
@@ -1707,7 +2409,7 @@
       </w:rPr>
     </w:lvl>
   </w:abstractNum>
-  <w:abstractNum w:abstractNumId="5" w15:restartNumberingAfterBreak="0">
+  <w:abstractNum w:abstractNumId="8" w15:restartNumberingAfterBreak="0">
     <w:nsid w:val="25B5408D"/>
     <w:multiLevelType w:val="hybridMultilevel"/>
     <w:tmpl w:val="C424356A"/>
@@ -1820,7 +2522,305 @@
       </w:rPr>
     </w:lvl>
   </w:abstractNum>
-  <w:abstractNum w:abstractNumId="6" w15:restartNumberingAfterBreak="0">
+  <w:abstractNum w:abstractNumId="9" w15:restartNumberingAfterBreak="0">
+    <w:nsid w:val="2AFF3D96"/>
+    <w:multiLevelType w:val="multilevel"/>
+    <w:tmpl w:val="BED0E30E"/>
+    <w:lvl w:ilvl="0">
+      <w:start w:val="1"/>
+      <w:numFmt w:val="bullet"/>
+      <w:lvlText w:val=""/>
+      <w:lvlJc w:val="left"/>
+      <w:pPr>
+        <w:tabs>
+          <w:tab w:val="num" w:pos="720"/>
+        </w:tabs>
+        <w:ind w:left="720" w:hanging="360"/>
+      </w:pPr>
+      <w:rPr>
+        <w:rFonts w:ascii="Symbol" w:hAnsi="Symbol" w:hint="default"/>
+        <w:sz w:val="20"/>
+      </w:rPr>
+    </w:lvl>
+    <w:lvl w:ilvl="1" w:tentative="1">
+      <w:start w:val="1"/>
+      <w:numFmt w:val="bullet"/>
+      <w:lvlText w:val="o"/>
+      <w:lvlJc w:val="left"/>
+      <w:pPr>
+        <w:tabs>
+          <w:tab w:val="num" w:pos="1440"/>
+        </w:tabs>
+        <w:ind w:left="1440" w:hanging="360"/>
+      </w:pPr>
+      <w:rPr>
+        <w:rFonts w:ascii="Courier New" w:hAnsi="Courier New" w:hint="default"/>
+        <w:sz w:val="20"/>
+      </w:rPr>
+    </w:lvl>
+    <w:lvl w:ilvl="2" w:tentative="1">
+      <w:start w:val="1"/>
+      <w:numFmt w:val="bullet"/>
+      <w:lvlText w:val=""/>
+      <w:lvlJc w:val="left"/>
+      <w:pPr>
+        <w:tabs>
+          <w:tab w:val="num" w:pos="2160"/>
+        </w:tabs>
+        <w:ind w:left="2160" w:hanging="360"/>
+      </w:pPr>
+      <w:rPr>
+        <w:rFonts w:ascii="Wingdings" w:hAnsi="Wingdings" w:hint="default"/>
+        <w:sz w:val="20"/>
+      </w:rPr>
+    </w:lvl>
+    <w:lvl w:ilvl="3" w:tentative="1">
+      <w:start w:val="1"/>
+      <w:numFmt w:val="bullet"/>
+      <w:lvlText w:val=""/>
+      <w:lvlJc w:val="left"/>
+      <w:pPr>
+        <w:tabs>
+          <w:tab w:val="num" w:pos="2880"/>
+        </w:tabs>
+        <w:ind w:left="2880" w:hanging="360"/>
+      </w:pPr>
+      <w:rPr>
+        <w:rFonts w:ascii="Wingdings" w:hAnsi="Wingdings" w:hint="default"/>
+        <w:sz w:val="20"/>
+      </w:rPr>
+    </w:lvl>
+    <w:lvl w:ilvl="4" w:tentative="1">
+      <w:start w:val="1"/>
+      <w:numFmt w:val="bullet"/>
+      <w:lvlText w:val=""/>
+      <w:lvlJc w:val="left"/>
+      <w:pPr>
+        <w:tabs>
+          <w:tab w:val="num" w:pos="3600"/>
+        </w:tabs>
+        <w:ind w:left="3600" w:hanging="360"/>
+      </w:pPr>
+      <w:rPr>
+        <w:rFonts w:ascii="Wingdings" w:hAnsi="Wingdings" w:hint="default"/>
+        <w:sz w:val="20"/>
+      </w:rPr>
+    </w:lvl>
+    <w:lvl w:ilvl="5" w:tentative="1">
+      <w:start w:val="1"/>
+      <w:numFmt w:val="bullet"/>
+      <w:lvlText w:val=""/>
+      <w:lvlJc w:val="left"/>
+      <w:pPr>
+        <w:tabs>
+          <w:tab w:val="num" w:pos="4320"/>
+        </w:tabs>
+        <w:ind w:left="4320" w:hanging="360"/>
+      </w:pPr>
+      <w:rPr>
+        <w:rFonts w:ascii="Wingdings" w:hAnsi="Wingdings" w:hint="default"/>
+        <w:sz w:val="20"/>
+      </w:rPr>
+    </w:lvl>
+    <w:lvl w:ilvl="6" w:tentative="1">
+      <w:start w:val="1"/>
+      <w:numFmt w:val="bullet"/>
+      <w:lvlText w:val=""/>
+      <w:lvlJc w:val="left"/>
+      <w:pPr>
+        <w:tabs>
+          <w:tab w:val="num" w:pos="5040"/>
+        </w:tabs>
+        <w:ind w:left="5040" w:hanging="360"/>
+      </w:pPr>
+      <w:rPr>
+        <w:rFonts w:ascii="Wingdings" w:hAnsi="Wingdings" w:hint="default"/>
+        <w:sz w:val="20"/>
+      </w:rPr>
+    </w:lvl>
+    <w:lvl w:ilvl="7" w:tentative="1">
+      <w:start w:val="1"/>
+      <w:numFmt w:val="bullet"/>
+      <w:lvlText w:val=""/>
+      <w:lvlJc w:val="left"/>
+      <w:pPr>
+        <w:tabs>
+          <w:tab w:val="num" w:pos="5760"/>
+        </w:tabs>
+        <w:ind w:left="5760" w:hanging="360"/>
+      </w:pPr>
+      <w:rPr>
+        <w:rFonts w:ascii="Wingdings" w:hAnsi="Wingdings" w:hint="default"/>
+        <w:sz w:val="20"/>
+      </w:rPr>
+    </w:lvl>
+    <w:lvl w:ilvl="8" w:tentative="1">
+      <w:start w:val="1"/>
+      <w:numFmt w:val="bullet"/>
+      <w:lvlText w:val=""/>
+      <w:lvlJc w:val="left"/>
+      <w:pPr>
+        <w:tabs>
+          <w:tab w:val="num" w:pos="6480"/>
+        </w:tabs>
+        <w:ind w:left="6480" w:hanging="360"/>
+      </w:pPr>
+      <w:rPr>
+        <w:rFonts w:ascii="Wingdings" w:hAnsi="Wingdings" w:hint="default"/>
+        <w:sz w:val="20"/>
+      </w:rPr>
+    </w:lvl>
+  </w:abstractNum>
+  <w:abstractNum w:abstractNumId="10" w15:restartNumberingAfterBreak="0">
+    <w:nsid w:val="37474B93"/>
+    <w:multiLevelType w:val="multilevel"/>
+    <w:tmpl w:val="07DCEA6A"/>
+    <w:lvl w:ilvl="0">
+      <w:start w:val="1"/>
+      <w:numFmt w:val="bullet"/>
+      <w:lvlText w:val=""/>
+      <w:lvlJc w:val="left"/>
+      <w:pPr>
+        <w:tabs>
+          <w:tab w:val="num" w:pos="720"/>
+        </w:tabs>
+        <w:ind w:left="720" w:hanging="360"/>
+      </w:pPr>
+      <w:rPr>
+        <w:rFonts w:ascii="Symbol" w:hAnsi="Symbol" w:hint="default"/>
+        <w:sz w:val="20"/>
+      </w:rPr>
+    </w:lvl>
+    <w:lvl w:ilvl="1" w:tentative="1">
+      <w:start w:val="1"/>
+      <w:numFmt w:val="bullet"/>
+      <w:lvlText w:val="o"/>
+      <w:lvlJc w:val="left"/>
+      <w:pPr>
+        <w:tabs>
+          <w:tab w:val="num" w:pos="1440"/>
+        </w:tabs>
+        <w:ind w:left="1440" w:hanging="360"/>
+      </w:pPr>
+      <w:rPr>
+        <w:rFonts w:ascii="Courier New" w:hAnsi="Courier New" w:hint="default"/>
+        <w:sz w:val="20"/>
+      </w:rPr>
+    </w:lvl>
+    <w:lvl w:ilvl="2" w:tentative="1">
+      <w:start w:val="1"/>
+      <w:numFmt w:val="bullet"/>
+      <w:lvlText w:val=""/>
+      <w:lvlJc w:val="left"/>
+      <w:pPr>
+        <w:tabs>
+          <w:tab w:val="num" w:pos="2160"/>
+        </w:tabs>
+        <w:ind w:left="2160" w:hanging="360"/>
+      </w:pPr>
+      <w:rPr>
+        <w:rFonts w:ascii="Wingdings" w:hAnsi="Wingdings" w:hint="default"/>
+        <w:sz w:val="20"/>
+      </w:rPr>
+    </w:lvl>
+    <w:lvl w:ilvl="3" w:tentative="1">
+      <w:start w:val="1"/>
+      <w:numFmt w:val="bullet"/>
+      <w:lvlText w:val=""/>
+      <w:lvlJc w:val="left"/>
+      <w:pPr>
+        <w:tabs>
+          <w:tab w:val="num" w:pos="2880"/>
+        </w:tabs>
+        <w:ind w:left="2880" w:hanging="360"/>
+      </w:pPr>
+      <w:rPr>
+        <w:rFonts w:ascii="Wingdings" w:hAnsi="Wingdings" w:hint="default"/>
+        <w:sz w:val="20"/>
+      </w:rPr>
+    </w:lvl>
+    <w:lvl w:ilvl="4" w:tentative="1">
+      <w:start w:val="1"/>
+      <w:numFmt w:val="bullet"/>
+      <w:lvlText w:val=""/>
+      <w:lvlJc w:val="left"/>
+      <w:pPr>
+        <w:tabs>
+          <w:tab w:val="num" w:pos="3600"/>
+        </w:tabs>
+        <w:ind w:left="3600" w:hanging="360"/>
+      </w:pPr>
+      <w:rPr>
+        <w:rFonts w:ascii="Wingdings" w:hAnsi="Wingdings" w:hint="default"/>
+        <w:sz w:val="20"/>
+      </w:rPr>
+    </w:lvl>
+    <w:lvl w:ilvl="5" w:tentative="1">
+      <w:start w:val="1"/>
+      <w:numFmt w:val="bullet"/>
+      <w:lvlText w:val=""/>
+      <w:lvlJc w:val="left"/>
+      <w:pPr>
+        <w:tabs>
+          <w:tab w:val="num" w:pos="4320"/>
+        </w:tabs>
+        <w:ind w:left="4320" w:hanging="360"/>
+      </w:pPr>
+      <w:rPr>
+        <w:rFonts w:ascii="Wingdings" w:hAnsi="Wingdings" w:hint="default"/>
+        <w:sz w:val="20"/>
+      </w:rPr>
+    </w:lvl>
+    <w:lvl w:ilvl="6" w:tentative="1">
+      <w:start w:val="1"/>
+      <w:numFmt w:val="bullet"/>
+      <w:lvlText w:val=""/>
+      <w:lvlJc w:val="left"/>
+      <w:pPr>
+        <w:tabs>
+          <w:tab w:val="num" w:pos="5040"/>
+        </w:tabs>
+        <w:ind w:left="5040" w:hanging="360"/>
+      </w:pPr>
+      <w:rPr>
+        <w:rFonts w:ascii="Wingdings" w:hAnsi="Wingdings" w:hint="default"/>
+        <w:sz w:val="20"/>
+      </w:rPr>
+    </w:lvl>
+    <w:lvl w:ilvl="7" w:tentative="1">
+      <w:start w:val="1"/>
+      <w:numFmt w:val="bullet"/>
+      <w:lvlText w:val=""/>
+      <w:lvlJc w:val="left"/>
+      <w:pPr>
+        <w:tabs>
+          <w:tab w:val="num" w:pos="5760"/>
+        </w:tabs>
+        <w:ind w:left="5760" w:hanging="360"/>
+      </w:pPr>
+      <w:rPr>
+        <w:rFonts w:ascii="Wingdings" w:hAnsi="Wingdings" w:hint="default"/>
+        <w:sz w:val="20"/>
+      </w:rPr>
+    </w:lvl>
+    <w:lvl w:ilvl="8" w:tentative="1">
+      <w:start w:val="1"/>
+      <w:numFmt w:val="bullet"/>
+      <w:lvlText w:val=""/>
+      <w:lvlJc w:val="left"/>
+      <w:pPr>
+        <w:tabs>
+          <w:tab w:val="num" w:pos="6480"/>
+        </w:tabs>
+        <w:ind w:left="6480" w:hanging="360"/>
+      </w:pPr>
+      <w:rPr>
+        <w:rFonts w:ascii="Wingdings" w:hAnsi="Wingdings" w:hint="default"/>
+        <w:sz w:val="20"/>
+      </w:rPr>
+    </w:lvl>
+  </w:abstractNum>
+  <w:abstractNum w:abstractNumId="11" w15:restartNumberingAfterBreak="0">
     <w:nsid w:val="3D7A2799"/>
     <w:multiLevelType w:val="hybridMultilevel"/>
     <w:tmpl w:val="B65C80F2"/>
@@ -1934,7 +2934,120 @@
       </w:rPr>
     </w:lvl>
   </w:abstractNum>
-  <w:abstractNum w:abstractNumId="7" w15:restartNumberingAfterBreak="0">
+  <w:abstractNum w:abstractNumId="12" w15:restartNumberingAfterBreak="0">
+    <w:nsid w:val="42E63749"/>
+    <w:multiLevelType w:val="multilevel"/>
+    <w:tmpl w:val="2F9CFF1E"/>
+    <w:lvl w:ilvl="0">
+      <w:start w:val="1"/>
+      <w:numFmt w:val="decimal"/>
+      <w:lvlText w:val="%1"/>
+      <w:lvlJc w:val="left"/>
+      <w:pPr>
+        <w:ind w:left="360" w:hanging="360"/>
+      </w:pPr>
+      <w:rPr>
+        <w:rFonts w:hint="default"/>
+      </w:rPr>
+    </w:lvl>
+    <w:lvl w:ilvl="1">
+      <w:start w:val="1"/>
+      <w:numFmt w:val="decimal"/>
+      <w:lvlText w:val="%1.%2"/>
+      <w:lvlJc w:val="left"/>
+      <w:pPr>
+        <w:ind w:left="360" w:hanging="360"/>
+      </w:pPr>
+      <w:rPr>
+        <w:rFonts w:hint="default"/>
+      </w:rPr>
+    </w:lvl>
+    <w:lvl w:ilvl="2">
+      <w:start w:val="1"/>
+      <w:numFmt w:val="decimal"/>
+      <w:lvlText w:val="%1.%2.%3"/>
+      <w:lvlJc w:val="left"/>
+      <w:pPr>
+        <w:ind w:left="720" w:hanging="720"/>
+      </w:pPr>
+      <w:rPr>
+        <w:rFonts w:hint="default"/>
+      </w:rPr>
+    </w:lvl>
+    <w:lvl w:ilvl="3">
+      <w:start w:val="1"/>
+      <w:numFmt w:val="decimal"/>
+      <w:lvlText w:val="%1.%2.%3.%4"/>
+      <w:lvlJc w:val="left"/>
+      <w:pPr>
+        <w:ind w:left="720" w:hanging="720"/>
+      </w:pPr>
+      <w:rPr>
+        <w:rFonts w:hint="default"/>
+      </w:rPr>
+    </w:lvl>
+    <w:lvl w:ilvl="4">
+      <w:start w:val="1"/>
+      <w:numFmt w:val="decimal"/>
+      <w:lvlText w:val="%1.%2.%3.%4.%5"/>
+      <w:lvlJc w:val="left"/>
+      <w:pPr>
+        <w:ind w:left="1080" w:hanging="1080"/>
+      </w:pPr>
+      <w:rPr>
+        <w:rFonts w:hint="default"/>
+      </w:rPr>
+    </w:lvl>
+    <w:lvl w:ilvl="5">
+      <w:start w:val="1"/>
+      <w:numFmt w:val="decimal"/>
+      <w:lvlText w:val="%1.%2.%3.%4.%5.%6"/>
+      <w:lvlJc w:val="left"/>
+      <w:pPr>
+        <w:ind w:left="1080" w:hanging="1080"/>
+      </w:pPr>
+      <w:rPr>
+        <w:rFonts w:hint="default"/>
+      </w:rPr>
+    </w:lvl>
+    <w:lvl w:ilvl="6">
+      <w:start w:val="1"/>
+      <w:numFmt w:val="decimal"/>
+      <w:lvlText w:val="%1.%2.%3.%4.%5.%6.%7"/>
+      <w:lvlJc w:val="left"/>
+      <w:pPr>
+        <w:ind w:left="1440" w:hanging="1440"/>
+      </w:pPr>
+      <w:rPr>
+        <w:rFonts w:hint="default"/>
+      </w:rPr>
+    </w:lvl>
+    <w:lvl w:ilvl="7">
+      <w:start w:val="1"/>
+      <w:numFmt w:val="decimal"/>
+      <w:lvlText w:val="%1.%2.%3.%4.%5.%6.%7.%8"/>
+      <w:lvlJc w:val="left"/>
+      <w:pPr>
+        <w:ind w:left="1440" w:hanging="1440"/>
+      </w:pPr>
+      <w:rPr>
+        <w:rFonts w:hint="default"/>
+      </w:rPr>
+    </w:lvl>
+    <w:lvl w:ilvl="8">
+      <w:start w:val="1"/>
+      <w:numFmt w:val="decimal"/>
+      <w:lvlText w:val="%1.%2.%3.%4.%5.%6.%7.%8.%9"/>
+      <w:lvlJc w:val="left"/>
+      <w:pPr>
+        <w:ind w:left="1440" w:hanging="1440"/>
+      </w:pPr>
+      <w:rPr>
+        <w:rFonts w:hint="default"/>
+      </w:rPr>
+    </w:lvl>
+  </w:abstractNum>
+  <w:abstractNum w:abstractNumId="13" w15:restartNumberingAfterBreak="0">
     <w:nsid w:val="74663C36"/>
     <w:multiLevelType w:val="hybridMultilevel"/>
     <w:tmpl w:val="FD14A30A"/>
@@ -2048,28 +3161,46 @@
     </w:lvl>
   </w:abstractNum>
   <w:num w:numId="1">
-    <w:abstractNumId w:val="2"/>
+    <w:abstractNumId w:val="3"/>
   </w:num>
   <w:num w:numId="2">
     <w:abstractNumId w:val="1"/>
   </w:num>
   <w:num w:numId="3">
-    <w:abstractNumId w:val="6"/>
+    <w:abstractNumId w:val="11"/>
   </w:num>
   <w:num w:numId="4">
-    <w:abstractNumId w:val="4"/>
+    <w:abstractNumId w:val="7"/>
   </w:num>
   <w:num w:numId="5">
     <w:abstractNumId w:val="0"/>
   </w:num>
   <w:num w:numId="6">
+    <w:abstractNumId w:val="8"/>
+  </w:num>
+  <w:num w:numId="7">
     <w:abstractNumId w:val="5"/>
   </w:num>
-  <w:num w:numId="7">
-    <w:abstractNumId w:val="3"/>
+  <w:num w:numId="8">
+    <w:abstractNumId w:val="13"/>
   </w:num>
-  <w:num w:numId="8">
-    <w:abstractNumId w:val="7"/>
+  <w:num w:numId="9">
+    <w:abstractNumId w:val="4"/>
+  </w:num>
+  <w:num w:numId="10">
+    <w:abstractNumId w:val="9"/>
+  </w:num>
+  <w:num w:numId="11">
+    <w:abstractNumId w:val="2"/>
+  </w:num>
+  <w:num w:numId="12">
+    <w:abstractNumId w:val="10"/>
+  </w:num>
+  <w:num w:numId="13">
+    <w:abstractNumId w:val="12"/>
+  </w:num>
+  <w:num w:numId="14">
+    <w:abstractNumId w:val="6"/>
   </w:num>
 </w:numbering>
 </file>
@@ -2539,6 +3670,16 @@
       </w:tblBorders>
     </w:tblPr>
   </w:style>
+  <w:style w:type="character" w:styleId="PlaceholderText">
+    <w:name w:val="Placeholder Text"/>
+    <w:basedOn w:val="DefaultParagraphFont"/>
+    <w:uiPriority w:val="99"/>
+    <w:semiHidden/>
+    <w:rsid w:val="0017117F"/>
+    <w:rPr>
+      <w:color w:val="808080"/>
+    </w:rPr>
+  </w:style>
 </w:styles>
 </file>
 

</xml_diff>